<commit_message>
Corregeix el nom de la UTAC
La UTAC és la Unitat de Tècniques Augmentatives de Comunicació. Es corregeix
a l'aplicació (Què és LECAA, Crèdits i guia), al LLEGEIX-ME, a la còpia de
la guia i a l'auditoria. Recalcula el hash del script i les sumes.

Co-Authored-By: Claude Opus 5.5 (1M context) <noreply@anthropic.com>
Claude-Session: https://claude.ai/code/session_011sh3PC8UMqcRL8KtgeMoR5
</commit_message>
<xml_diff>
--- a/historial/Auditoria_LECAA_2026-10-16.docx
+++ b/historial/Auditoria_LECAA_2026-10-16.docx
@@ -3573,7 +3573,7 @@
           <w:i w:val="0"/>
           <w:sz w:val="21"/>
         </w:rPr>
-        <w:t xml:space="preserve">Unitat de Tècniques Augmentatives i Alternatives de Comunicació. (2026a). </w:t>
+        <w:t xml:space="preserve">Unitat de Tècniques Augmentatives de Comunicació. (2026a). </w:t>
       </w:r>
       <w:r>
         <w:rPr>
@@ -3603,7 +3603,7 @@
           <w:i w:val="0"/>
           <w:sz w:val="21"/>
         </w:rPr>
-        <w:t xml:space="preserve">Unitat de Tècniques Augmentatives i Alternatives de Comunicació. (2026b). </w:t>
+        <w:t xml:space="preserve">Unitat de Tècniques Augmentatives de Comunicació. (2026b). </w:t>
       </w:r>
       <w:r>
         <w:rPr>
@@ -3704,6 +3704,7 @@
     </w:p>
     <w:sectPr>
       <w:footerReference w:type="default" r:id="rId9"/>
+      <w:headerReference w:type="default" r:id="rId17"/>
       <w:pgSz w:w="12240" w:h="15840"/>
       <w:pgMar w:top="1037" w:right="1080" w:bottom="1008" w:left="1080" w:header="720" w:footer="461" w:gutter="0"/>
       <w:cols w:space="720"/>
@@ -3754,6 +3755,16 @@
     </w:r>
   </w:p>
 </w:ftr>
+</file>
+
+<file path=word/header1.xml><?xml version="1.0" encoding="utf-8"?>
+<w:hdr xmlns:m="http://schemas.openxmlformats.org/officeDocument/2006/math" xmlns:mc="http://schemas.openxmlformats.org/markup-compatibility/2006" xmlns:mo="http://schemas.microsoft.com/office/mac/office/2008/main" xmlns:mv="urn:schemas-microsoft-com:mac:vml" xmlns:o="urn:schemas-microsoft-com:office:office" xmlns:r="http://schemas.openxmlformats.org/officeDocument/2006/relationships" xmlns:v="urn:schemas-microsoft-com:vml" xmlns:w10="urn:schemas-microsoft-com:office:word" xmlns:w14="http://schemas.microsoft.com/office/word/2010/wordml" xmlns:w="http://schemas.openxmlformats.org/wordprocessingml/2006/main" xmlns:wne="http://schemas.microsoft.com/office/word/2006/wordml" xmlns:wp14="http://schemas.microsoft.com/office/word/2010/wordprocessingDrawing" xmlns:wp="http://schemas.openxmlformats.org/drawingml/2006/wordprocessingDrawing" xmlns:wpc="http://schemas.microsoft.com/office/word/2010/wordprocessingCanvas" xmlns:wpg="http://schemas.microsoft.com/office/word/2010/wordprocessingGroup" xmlns:wpi="http://schemas.microsoft.com/office/word/2010/wordprocessingInk" xmlns:wps="http://schemas.microsoft.com/office/word/2010/wordprocessingShape" mc:Ignorable="w14 wp14">
+  <w:p>
+    <w:pPr>
+      <w:pStyle w:val="Header"/>
+    </w:pPr>
+  </w:p>
+</w:hdr>
 </file>
 
 <file path=word/numbering.xml><?xml version="1.0" encoding="utf-8"?>

</xml_diff>